<commit_message>
Đặc tả v0.12: D-11 ghi rõ duyệt mượn giữ theo phòng ban; rollback không chịu giới hạn sửa
- D-11: duyệt yêu cầu mượn và ghi nhận trả (P2-07) không đổi - Kiểm duyệt viên phòng ban của tài liệu
  và Admin, ở mọi trạng thái duyệt; chia sẻ không mở quyền này.
- P2-09: rollback là công cụ khôi phục của Admin, không chịu giới hạn SỬA của D-11 (vẫn kiểm dữ liệu
  đổi sau đó, có audit). File 3: UC-08b (3c), UC-16 (1b), bảng thay đổi v0.12.

Co-Authored-By: Claude Opus 5.5 <noreply@anthropic.com>
</commit_message>
<xml_diff>
--- a/document/0 -Dac_ta_SDD_v0.12.docx
+++ b/document/0 -Dac_ta_SDD_v0.12.docx
@@ -5244,7 +5244,7 @@
           <w:sz w:val="20"/>
           <w:szCs w:val="20"/>
         </w:rPr>
-        <w:t xml:space="preserve">Module: rollback. UC-08b.</w:t>
+        <w:t>Từ v0.12 (D-11) rollback là công cụ khôi phục của Admin, không chịu giới hạn SỬA theo trạng thái duyệt (vẫn kiểm dữ liệu đổi sau đó và ghi audit). Module: rollback. UC-08b.</w:t>
       </w:r>
     </w:p>
     <w:p>
@@ -16477,7 +16477,7 @@
                 <w:sz w:val="17"/>
                 <w:szCs w:val="17"/>
               </w:rPr>
-              <w:t>Quyền sửa theo chủ sở hữu và trạng thái duyệt (thay phần quyền quản lý theo phòng ban của D-02; quyền xem không đổi). Nhóm thao tác SỬA: sửa tiêu đề/số hiệu/danh mục (kể cả áp dụng gợi ý P2-05, gán vị trí lưu trữ), sửa nội dung OCR và khôi phục phiên bản, trích xuất/xác nhận trường (P2-04). Nháp, Bị từ chối (hoặc cờ workflow tắt): chỉ chủ sở hữu được SỬA, chạy lại OCR (kể cả chạy lại job OCR lỗi), gửi duyệt, xóa mềm. Chờ duyệt, Đã duyệt: chủ sở hữu chỉ xem và được Rút lại (về Nháp); Kiểm duyệt viên phòng ban của tài liệu và Admin được SỬA nhưng không chạy lại OCR. Đã xuất bản: không ai SỬA; Kiểm duyệt viên/Admin hủy xuất bản; chia sẻ: chủ sở hữu, Kiểm duyệt viên phòng ban của tài liệu, Admin. Đã hủy xuất bản: Kiểm duyệt viên/Admin SỬA (không chạy lại OCR), xuất bản lại hoặc Trả lại cho chủ sở hữu (về Nháp, kèm ghi chú). Admin không chạy lại OCR tài liệu không phải của mình nhưng dừng được job kẹt; Admin xóa mềm ở mọi trạng thái; khôi phục từ thùng rác: chủ sở hữu, Admin. Đồng nghiệp cùng phòng ban chỉ xem. Rollback (P2-09) là công cụ khôi phục của Admin theo nhật ký, không chịu giới hạn SỬA (có audit). API trả DocumentOut.permissions để React hiện/ẩn từng nút; server luôn kiểm và trả 403.</w:t>
+              <w:t>Quyền sửa theo chủ sở hữu và trạng thái duyệt (thay phần quyền quản lý theo phòng ban của D-02; quyền xem không đổi). Nhóm thao tác SỬA: sửa tiêu đề/số hiệu/danh mục (kể cả áp dụng gợi ý P2-05, gán vị trí lưu trữ), sửa nội dung OCR và khôi phục phiên bản, trích xuất/xác nhận trường (P2-04). Nháp, Bị từ chối (hoặc cờ workflow tắt): chỉ chủ sở hữu được SỬA, chạy lại OCR (kể cả chạy lại job OCR lỗi), gửi duyệt, xóa mềm. Chờ duyệt, Đã duyệt: chủ sở hữu chỉ xem và được Rút lại (về Nháp); Kiểm duyệt viên phòng ban của tài liệu và Admin được SỬA nhưng không chạy lại OCR. Đã xuất bản: không ai SỬA; Kiểm duyệt viên/Admin hủy xuất bản; chia sẻ: chủ sở hữu, Kiểm duyệt viên phòng ban của tài liệu, Admin. Đã hủy xuất bản: Kiểm duyệt viên/Admin SỬA (không chạy lại OCR), xuất bản lại hoặc Trả lại cho chủ sở hữu (về Nháp, kèm ghi chú). Admin không chạy lại OCR tài liệu không phải của mình nhưng dừng được job kẹt; Admin xóa mềm ở mọi trạng thái; khôi phục từ thùng rác: chủ sở hữu, Admin. Đồng nghiệp cùng phòng ban chỉ xem. Rollback (P2-09) là công cụ khôi phục của Admin theo nhật ký, không chịu giới hạn SỬA (có audit). Duyệt yêu cầu mượn và ghi nhận trả (P2-07) không đổi: Kiểm duyệt viên phòng ban của tài liệu và Admin, ở mọi trạng thái duyệt; chia sẻ không mở quyền này. API trả DocumentOut.permissions để React hiện/ẩn từng nút; server luôn kiểm và trả 403.</w:t>
             </w:r>
           </w:p>
         </w:tc>

</xml_diff>